<commit_message>
Version 1.6.37 - Estado completamente funcional pre-refactor
</commit_message>
<xml_diff>
--- a/CORS muy importante y 7 pasos para cliente nuevo.docx
+++ b/CORS muy importante y 7 pasos para cliente nuevo.docx
@@ -4,7 +4,15 @@
   <w:body>
     <w:p>
       <w:r>
-        <w:t>¡Listo! He implementado las mejoras en la descarga y subido la nueva versión de tu aplicación (Deploy completado con éxito).</w:t>
+        <w:t>¡Listo! He implementado las mejoras en la descarga y subido la nueva versión de tu aplicación (</w:t>
+      </w:r>
+      <w:proofErr w:type="spellStart"/>
+      <w:r>
+        <w:t>Deploy</w:t>
+      </w:r>
+      <w:proofErr w:type="spellEnd"/>
+      <w:r>
+        <w:t xml:space="preserve"> completado con éxito).</w:t>
       </w:r>
     </w:p>
     <w:p>
@@ -51,7 +59,15 @@
         <w:t>Descarga Directa Robusta</w:t>
       </w:r>
       <w:r>
-        <w:t>: El botón individual de descarga ahora no usa un link tradicional (que a veces te abría la imagen en una pestaña nueva en vez de guardarla), sino que lanza una petición robusta en segundo plano para obligar al archivo a descargarse al instante.</w:t>
+        <w:t xml:space="preserve">: El botón individual de descarga ahora no usa un </w:t>
+      </w:r>
+      <w:proofErr w:type="gramStart"/>
+      <w:r>
+        <w:t>link</w:t>
+      </w:r>
+      <w:proofErr w:type="gramEnd"/>
+      <w:r>
+        <w:t xml:space="preserve"> tradicional (que a veces te abría la imagen en una pestaña nueva en vez de guardarla), sino que lanza una petición robusta en segundo plano para obligar al archivo a descargarse al instante.</w:t>
       </w:r>
     </w:p>
     <w:p>
@@ -67,7 +83,15 @@
     </w:p>
     <w:p>
       <w:r>
-        <w:t>Para arreglar definitivamente el problema de que "se queda cargando muchísimo y al final no descarga" (Timeout), los navegadores exigen que tu servidor Storage tenga activadas las políticas de acceso CORS. </w:t>
+        <w:t>Para arreglar definitivamente el problema de que "se queda cargando muchísimo y al final no descarga" (</w:t>
+      </w:r>
+      <w:proofErr w:type="spellStart"/>
+      <w:r>
+        <w:t>Timeout</w:t>
+      </w:r>
+      <w:proofErr w:type="spellEnd"/>
+      <w:r>
+        <w:t>), los navegadores exigen que tu servidor Storage tenga activadas las políticas de acceso CORS. </w:t>
       </w:r>
       <w:r>
         <w:rPr>
@@ -82,7 +106,17 @@
     </w:p>
     <w:p>
       <w:r>
-        <w:t>He dejado en la raíz de tu proyecto un archivo llamado cors.json. Haz lo siguiente:</w:t>
+        <w:t>He dejado en la raíz de tu proyecto un archivo llamado </w:t>
+      </w:r>
+      <w:proofErr w:type="spellStart"/>
+      <w:proofErr w:type="gramStart"/>
+      <w:r>
+        <w:t>cors.json</w:t>
+      </w:r>
+      <w:proofErr w:type="spellEnd"/>
+      <w:proofErr w:type="gramEnd"/>
+      <w:r>
+        <w:t>. Haz lo siguiente:</w:t>
       </w:r>
     </w:p>
     <w:p>
@@ -93,7 +127,15 @@
         </w:numPr>
       </w:pPr>
       <w:r>
-        <w:t xml:space="preserve">Ingresa a la consola de Google Cloud Platform de tu proyecto. El enlace directo para abrir la consola es: </w:t>
+        <w:t xml:space="preserve">Ingresa a la consola de Google Cloud </w:t>
+      </w:r>
+      <w:proofErr w:type="spellStart"/>
+      <w:r>
+        <w:t>Platform</w:t>
+      </w:r>
+      <w:proofErr w:type="spellEnd"/>
+      <w:r>
+        <w:t xml:space="preserve"> de tu proyecto. El enlace directo para abrir la consola es: </w:t>
       </w:r>
       <w:r>
         <w:rPr>
@@ -144,7 +186,15 @@
         </w:numPr>
       </w:pPr>
       <w:r>
-        <w:t>Corre el siguiente comando, literal y exacto (cambiamos tu bucket temporalmente y le cargamos las reglas):</w:t>
+        <w:t xml:space="preserve">Corre el siguiente comando, literal y exacto (cambiamos tu </w:t>
+      </w:r>
+      <w:proofErr w:type="spellStart"/>
+      <w:r>
+        <w:t>bucket</w:t>
+      </w:r>
+      <w:proofErr w:type="spellEnd"/>
+      <w:r>
+        <w:t xml:space="preserve"> temporalmente y le cargamos las reglas):</w:t>
       </w:r>
     </w:p>
     <w:p>
@@ -159,17 +209,77 @@
           <w:color w:val="EE0000"/>
           <w:lang w:val="en-US"/>
         </w:rPr>
-        <w:t>echo '[{"origin": ["*"],"method": ["GET"],"maxAgeSeconds": 3600}]' &gt; cors.json</w:t>
-      </w:r>
-    </w:p>
-    <w:p>
-      <w:pPr>
-        <w:rPr>
-          <w:lang w:val="en-US"/>
-        </w:rPr>
-      </w:pPr>
-      <w:r>
-        <w:rPr>
+        <w:t xml:space="preserve">echo </w:t>
+      </w:r>
+      <w:proofErr w:type="gramStart"/>
+      <w:r>
+        <w:rPr>
+          <w:color w:val="EE0000"/>
+          <w:lang w:val="en-US"/>
+        </w:rPr>
+        <w:t>'[{</w:t>
+      </w:r>
+      <w:proofErr w:type="gramEnd"/>
+      <w:r>
+        <w:rPr>
+          <w:color w:val="EE0000"/>
+          <w:lang w:val="en-US"/>
+        </w:rPr>
+        <w:t>"origin": ["*"],"method": ["GET"],"</w:t>
+      </w:r>
+      <w:proofErr w:type="spellStart"/>
+      <w:r>
+        <w:rPr>
+          <w:color w:val="EE0000"/>
+          <w:lang w:val="en-US"/>
+        </w:rPr>
+        <w:t>maxAgeSeconds</w:t>
+      </w:r>
+      <w:proofErr w:type="spellEnd"/>
+      <w:r>
+        <w:rPr>
+          <w:color w:val="EE0000"/>
+          <w:lang w:val="en-US"/>
+        </w:rPr>
+        <w:t xml:space="preserve">": </w:t>
+      </w:r>
+      <w:proofErr w:type="gramStart"/>
+      <w:r>
+        <w:rPr>
+          <w:color w:val="EE0000"/>
+          <w:lang w:val="en-US"/>
+        </w:rPr>
+        <w:t>3600}]</w:t>
+      </w:r>
+      <w:proofErr w:type="gramEnd"/>
+      <w:r>
+        <w:rPr>
+          <w:color w:val="EE0000"/>
+          <w:lang w:val="en-US"/>
+        </w:rPr>
+        <w:t xml:space="preserve">' &gt; </w:t>
+      </w:r>
+      <w:proofErr w:type="spellStart"/>
+      <w:proofErr w:type="gramStart"/>
+      <w:r>
+        <w:rPr>
+          <w:color w:val="EE0000"/>
+          <w:lang w:val="en-US"/>
+        </w:rPr>
+        <w:t>cors.json</w:t>
+      </w:r>
+      <w:proofErr w:type="spellEnd"/>
+      <w:proofErr w:type="gramEnd"/>
+    </w:p>
+    <w:p>
+      <w:pPr>
+        <w:rPr>
+          <w:lang w:val="en-US"/>
+        </w:rPr>
+      </w:pPr>
+      <w:r>
+        <w:rPr>
+          <w:noProof/>
           <w:lang w:val="en-US"/>
         </w:rPr>
         <w:drawing>
@@ -216,6 +326,7 @@
       </w:r>
       <w:r>
         <w:rPr>
+          <w:noProof/>
           <w:lang w:val="en-US"/>
         </w:rPr>
         <w:drawing>
@@ -259,19 +370,31 @@
       <w:pPr>
         <w:rPr>
           <w:color w:val="EE0000"/>
+          <w:lang w:val="en-US"/>
         </w:rPr>
       </w:pPr>
       <w:r>
         <w:rPr>
           <w:color w:val="EE0000"/>
-        </w:rPr>
-        <w:t>gcloud storage buckets update gs://control-de-entrada-3d85b.firebasestorage.app --cors-file=cors.json</w:t>
-      </w:r>
-    </w:p>
-    <w:p>
-      <w:pPr>
+          <w:lang w:val="en-US"/>
+        </w:rPr>
+        <w:t>gcloud storage buckets update gs://control-de-entrada-3d85b.firebasestorage.app --cors-file=</w:t>
+      </w:r>
+      <w:proofErr w:type="gramStart"/>
+      <w:r>
         <w:rPr>
           <w:color w:val="EE0000"/>
+          <w:lang w:val="en-US"/>
+        </w:rPr>
+        <w:t>cors.json</w:t>
+      </w:r>
+      <w:proofErr w:type="gramEnd"/>
+    </w:p>
+    <w:p>
+      <w:pPr>
+        <w:rPr>
+          <w:color w:val="EE0000"/>
+          <w:lang w:val="en-US"/>
         </w:rPr>
       </w:pPr>
     </w:p>
@@ -328,7 +451,15 @@
     </w:p>
     <w:p>
       <w:r>
-        <w:t xml:space="preserve">Como se depliega desde </w:t>
+        <w:t xml:space="preserve">Como se </w:t>
+      </w:r>
+      <w:proofErr w:type="spellStart"/>
+      <w:r>
+        <w:t>depliega</w:t>
+      </w:r>
+      <w:proofErr w:type="spellEnd"/>
+      <w:r>
+        <w:t xml:space="preserve"> desde </w:t>
       </w:r>
       <w:hyperlink r:id="rId9" w:history="1">
         <w:r>
@@ -406,7 +537,23 @@
           <w:b/>
           <w:bCs/>
         </w:rPr>
-        <w:t xml:space="preserve"> Checklist: Instalación para Cliente Nuevo</w:t>
+        <w:t xml:space="preserve"> </w:t>
+      </w:r>
+      <w:proofErr w:type="spellStart"/>
+      <w:r>
+        <w:rPr>
+          <w:b/>
+          <w:bCs/>
+        </w:rPr>
+        <w:t>Checklist</w:t>
+      </w:r>
+      <w:proofErr w:type="spellEnd"/>
+      <w:r>
+        <w:rPr>
+          <w:b/>
+          <w:bCs/>
+        </w:rPr>
+        <w:t>: Instalación para Cliente Nuevo</w:t>
       </w:r>
     </w:p>
     <w:p/>
@@ -438,8 +585,17 @@
           <w:b/>
           <w:bCs/>
         </w:rPr>
-        <w:t>## PASO 1 — El Cliente Crea su Proyecto Firebase</w:t>
-      </w:r>
+        <w:t xml:space="preserve">## PASO 1 — El Cliente Crea su Proyecto </w:t>
+      </w:r>
+      <w:proofErr w:type="spellStart"/>
+      <w:r>
+        <w:rPr>
+          <w:b/>
+          <w:bCs/>
+        </w:rPr>
+        <w:t>Firebase</w:t>
+      </w:r>
+      <w:proofErr w:type="spellEnd"/>
     </w:p>
     <w:p/>
     <w:p>
@@ -468,7 +624,15 @@
         <w:t>**Blaze**</w:t>
       </w:r>
       <w:r>
-        <w:t xml:space="preserve"> si va a usar Cloud Functions).</w:t>
+        <w:t xml:space="preserve"> si va a usar Cloud </w:t>
+      </w:r>
+      <w:proofErr w:type="spellStart"/>
+      <w:r>
+        <w:t>Functions</w:t>
+      </w:r>
+      <w:proofErr w:type="spellEnd"/>
+      <w:r>
+        <w:t>).</w:t>
       </w:r>
     </w:p>
     <w:p>
@@ -503,7 +667,25 @@
           <w:bCs/>
           <w:lang w:val="en-US"/>
         </w:rPr>
-        <w:t>**Firestore**</w:t>
+        <w:t>**</w:t>
+      </w:r>
+      <w:proofErr w:type="spellStart"/>
+      <w:r>
+        <w:rPr>
+          <w:b/>
+          <w:bCs/>
+          <w:lang w:val="en-US"/>
+        </w:rPr>
+        <w:t>Firestore</w:t>
+      </w:r>
+      <w:proofErr w:type="spellEnd"/>
+      <w:r>
+        <w:rPr>
+          <w:b/>
+          <w:bCs/>
+          <w:lang w:val="en-US"/>
+        </w:rPr>
+        <w:t>**</w:t>
       </w:r>
       <w:r>
         <w:rPr>
@@ -589,7 +771,23 @@
           <w:b/>
           <w:bCs/>
         </w:rPr>
-        <w:t>### En Firebase Console</w:t>
+        <w:t xml:space="preserve">### En </w:t>
+      </w:r>
+      <w:proofErr w:type="spellStart"/>
+      <w:r>
+        <w:rPr>
+          <w:b/>
+          <w:bCs/>
+        </w:rPr>
+        <w:t>Firebase</w:t>
+      </w:r>
+      <w:proofErr w:type="spellEnd"/>
+      <w:r>
+        <w:rPr>
+          <w:b/>
+          <w:bCs/>
+        </w:rPr>
+        <w:t xml:space="preserve"> Console</w:t>
       </w:r>
     </w:p>
     <w:p>
@@ -665,7 +863,23 @@
     </w:p>
     <w:p>
       <w:r>
-        <w:t>- Ve a: `console.cloud.google.com/iam-admin/iam` (seleccionar el proyecto del cliente)</w:t>
+        <w:t>- Ve a: `console.cloud.google.com/</w:t>
+      </w:r>
+      <w:proofErr w:type="spellStart"/>
+      <w:r>
+        <w:t>iam-admin</w:t>
+      </w:r>
+      <w:proofErr w:type="spellEnd"/>
+      <w:r>
+        <w:t>/</w:t>
+      </w:r>
+      <w:proofErr w:type="spellStart"/>
+      <w:r>
+        <w:t>iam</w:t>
+      </w:r>
+      <w:proofErr w:type="spellEnd"/>
+      <w:r>
+        <w:t>` (seleccionar el proyecto del cliente)</w:t>
       </w:r>
     </w:p>
     <w:p>
@@ -720,90 +934,170 @@
           <w:i/>
           <w:iCs/>
         </w:rPr>
-        <w:t>*(Service Usage Consumer)*</w:t>
-      </w:r>
-    </w:p>
-    <w:p>
-      <w:r>
-        <w:t xml:space="preserve">  - </w:t>
-      </w:r>
-      <w:r>
-        <w:rPr>
-          <w:rFonts w:ascii="Segoe UI Emoji" w:hAnsi="Segoe UI Emoji" w:cs="Segoe UI Emoji"/>
-        </w:rPr>
-        <w:t>✅</w:t>
-      </w:r>
-      <w:r>
-        <w:t xml:space="preserve"> </w:t>
-      </w:r>
-      <w:r>
-        <w:rPr>
-          <w:b/>
-          <w:bCs/>
-        </w:rPr>
-        <w:t>**Administrador de IAM de proyecto**</w:t>
-      </w:r>
-      <w:r>
-        <w:t xml:space="preserve"> </w:t>
-      </w:r>
+        <w:t xml:space="preserve">*(Service </w:t>
+      </w:r>
+      <w:proofErr w:type="spellStart"/>
       <w:r>
         <w:rPr>
           <w:i/>
           <w:iCs/>
         </w:rPr>
-        <w:t>*(Project IAM Admin)*</w:t>
-      </w:r>
-    </w:p>
-    <w:p>
-      <w:pPr>
-        <w:rPr>
-          <w:lang w:val="en-US"/>
-        </w:rPr>
-      </w:pPr>
-      <w:r>
-        <w:t xml:space="preserve">  </w:t>
-      </w:r>
-      <w:r>
-        <w:rPr>
-          <w:lang w:val="en-US"/>
-        </w:rPr>
-        <w:t xml:space="preserve">- </w:t>
-      </w:r>
-      <w:r>
-        <w:rPr>
-          <w:rFonts w:ascii="Segoe UI Emoji" w:hAnsi="Segoe UI Emoji" w:cs="Segoe UI Emoji"/>
-          <w:lang w:val="en-US"/>
-        </w:rPr>
-        <w:t>✅</w:t>
-      </w:r>
-      <w:r>
-        <w:rPr>
-          <w:lang w:val="en-US"/>
-        </w:rPr>
-        <w:t xml:space="preserve"> </w:t>
-      </w:r>
-      <w:r>
-        <w:rPr>
-          <w:b/>
-          <w:bCs/>
-          <w:lang w:val="en-US"/>
-        </w:rPr>
-        <w:t>**Administrador de Cloud Functions**</w:t>
-      </w:r>
-      <w:r>
-        <w:rPr>
-          <w:lang w:val="en-US"/>
-        </w:rPr>
-        <w:t xml:space="preserve"> </w:t>
-      </w:r>
+        <w:t>Usage</w:t>
+      </w:r>
+      <w:proofErr w:type="spellEnd"/>
       <w:r>
         <w:rPr>
           <w:i/>
           <w:iCs/>
-          <w:lang w:val="en-US"/>
-        </w:rPr>
-        <w:t>*(Cloud Functions Admin)*</w:t>
-      </w:r>
+        </w:rPr>
+        <w:t xml:space="preserve"> </w:t>
+      </w:r>
+      <w:proofErr w:type="spellStart"/>
+      <w:proofErr w:type="gramStart"/>
+      <w:r>
+        <w:rPr>
+          <w:i/>
+          <w:iCs/>
+        </w:rPr>
+        <w:t>Consumer</w:t>
+      </w:r>
+      <w:proofErr w:type="spellEnd"/>
+      <w:r>
+        <w:rPr>
+          <w:i/>
+          <w:iCs/>
+        </w:rPr>
+        <w:t>)*</w:t>
+      </w:r>
+      <w:proofErr w:type="gramEnd"/>
+    </w:p>
+    <w:p>
+      <w:r>
+        <w:t xml:space="preserve">  - </w:t>
+      </w:r>
+      <w:r>
+        <w:rPr>
+          <w:rFonts w:ascii="Segoe UI Emoji" w:hAnsi="Segoe UI Emoji" w:cs="Segoe UI Emoji"/>
+        </w:rPr>
+        <w:t>✅</w:t>
+      </w:r>
+      <w:r>
+        <w:t xml:space="preserve"> </w:t>
+      </w:r>
+      <w:r>
+        <w:rPr>
+          <w:b/>
+          <w:bCs/>
+        </w:rPr>
+        <w:t>**Administrador de IAM de proyecto**</w:t>
+      </w:r>
+      <w:r>
+        <w:t xml:space="preserve"> </w:t>
+      </w:r>
+      <w:r>
+        <w:rPr>
+          <w:i/>
+          <w:iCs/>
+        </w:rPr>
+        <w:t xml:space="preserve">*(Project IAM </w:t>
+      </w:r>
+      <w:proofErr w:type="spellStart"/>
+      <w:proofErr w:type="gramStart"/>
+      <w:r>
+        <w:rPr>
+          <w:i/>
+          <w:iCs/>
+        </w:rPr>
+        <w:t>Admin</w:t>
+      </w:r>
+      <w:proofErr w:type="spellEnd"/>
+      <w:r>
+        <w:rPr>
+          <w:i/>
+          <w:iCs/>
+        </w:rPr>
+        <w:t>)*</w:t>
+      </w:r>
+      <w:proofErr w:type="gramEnd"/>
+    </w:p>
+    <w:p>
+      <w:pPr>
+        <w:rPr>
+          <w:lang w:val="en-US"/>
+        </w:rPr>
+      </w:pPr>
+      <w:r>
+        <w:t xml:space="preserve">  </w:t>
+      </w:r>
+      <w:r>
+        <w:rPr>
+          <w:lang w:val="en-US"/>
+        </w:rPr>
+        <w:t xml:space="preserve">- </w:t>
+      </w:r>
+      <w:r>
+        <w:rPr>
+          <w:rFonts w:ascii="Segoe UI Emoji" w:hAnsi="Segoe UI Emoji" w:cs="Segoe UI Emoji"/>
+          <w:lang w:val="en-US"/>
+        </w:rPr>
+        <w:t>✅</w:t>
+      </w:r>
+      <w:r>
+        <w:rPr>
+          <w:lang w:val="en-US"/>
+        </w:rPr>
+        <w:t xml:space="preserve"> </w:t>
+      </w:r>
+      <w:r>
+        <w:rPr>
+          <w:b/>
+          <w:bCs/>
+          <w:lang w:val="en-US"/>
+        </w:rPr>
+        <w:t>**</w:t>
+      </w:r>
+      <w:proofErr w:type="spellStart"/>
+      <w:r>
+        <w:rPr>
+          <w:b/>
+          <w:bCs/>
+          <w:lang w:val="en-US"/>
+        </w:rPr>
+        <w:t>Administrador</w:t>
+      </w:r>
+      <w:proofErr w:type="spellEnd"/>
+      <w:r>
+        <w:rPr>
+          <w:b/>
+          <w:bCs/>
+          <w:lang w:val="en-US"/>
+        </w:rPr>
+        <w:t xml:space="preserve"> de Cloud Functions**</w:t>
+      </w:r>
+      <w:r>
+        <w:rPr>
+          <w:lang w:val="en-US"/>
+        </w:rPr>
+        <w:t xml:space="preserve"> </w:t>
+      </w:r>
+      <w:r>
+        <w:rPr>
+          <w:i/>
+          <w:iCs/>
+          <w:lang w:val="en-US"/>
+        </w:rPr>
+        <w:t xml:space="preserve">*(Cloud Functions </w:t>
+      </w:r>
+      <w:proofErr w:type="gramStart"/>
+      <w:r>
+        <w:rPr>
+          <w:i/>
+          <w:iCs/>
+          <w:lang w:val="en-US"/>
+        </w:rPr>
+        <w:t>Admin)*</w:t>
+      </w:r>
+      <w:proofErr w:type="gramEnd"/>
     </w:p>
     <w:p>
       <w:r>
@@ -829,12 +1123,36 @@
     <w:p/>
     <w:p>
       <w:r>
-        <w:t>1. Copia una carpeta existente en `Clientes/` (ej: `Clientes/Bourbon`)</w:t>
-      </w:r>
-    </w:p>
-    <w:p>
-      <w:r>
-        <w:t>2. Renómbrala con el nombre del cliente (ej: `Clientes/NuevoRestaurante`)</w:t>
+        <w:t>1. Copia una carpeta existente en `Clientes/` (</w:t>
+      </w:r>
+      <w:proofErr w:type="spellStart"/>
+      <w:r>
+        <w:t>ej</w:t>
+      </w:r>
+      <w:proofErr w:type="spellEnd"/>
+      <w:r>
+        <w:t>: `Clientes/Bourbon`)</w:t>
+      </w:r>
+    </w:p>
+    <w:p>
+      <w:r>
+        <w:t>2. Renómbrala con el nombre del cliente (</w:t>
+      </w:r>
+      <w:proofErr w:type="spellStart"/>
+      <w:r>
+        <w:t>ej</w:t>
+      </w:r>
+      <w:proofErr w:type="spellEnd"/>
+      <w:r>
+        <w:t>: `Clientes/</w:t>
+      </w:r>
+      <w:proofErr w:type="spellStart"/>
+      <w:r>
+        <w:t>NuevoRestaurante</w:t>
+      </w:r>
+      <w:proofErr w:type="spellEnd"/>
+      <w:r>
+        <w:t>`)</w:t>
       </w:r>
     </w:p>
     <w:p>
@@ -851,10 +1169,51 @@
           <w:b/>
           <w:bCs/>
         </w:rPr>
-        <w:t>**`.env`**</w:t>
-      </w:r>
-      <w:r>
-        <w:t xml:space="preserve"> → Cambia las keys de Firebase, nombre del cliente, logo URL, versión</w:t>
+        <w:t>**</w:t>
+      </w:r>
+      <w:proofErr w:type="gramStart"/>
+      <w:r>
+        <w:rPr>
+          <w:b/>
+          <w:bCs/>
+        </w:rPr>
+        <w:t>`.</w:t>
+      </w:r>
+      <w:proofErr w:type="spellStart"/>
+      <w:r>
+        <w:rPr>
+          <w:b/>
+          <w:bCs/>
+        </w:rPr>
+        <w:t>env</w:t>
+      </w:r>
+      <w:proofErr w:type="spellEnd"/>
+      <w:proofErr w:type="gramEnd"/>
+      <w:r>
+        <w:rPr>
+          <w:b/>
+          <w:bCs/>
+        </w:rPr>
+        <w:t>`**</w:t>
+      </w:r>
+      <w:r>
+        <w:t xml:space="preserve"> → Cambia las </w:t>
+      </w:r>
+      <w:proofErr w:type="spellStart"/>
+      <w:r>
+        <w:t>keys</w:t>
+      </w:r>
+      <w:proofErr w:type="spellEnd"/>
+      <w:r>
+        <w:t xml:space="preserve"> de </w:t>
+      </w:r>
+      <w:proofErr w:type="spellStart"/>
+      <w:r>
+        <w:t>Firebase</w:t>
+      </w:r>
+      <w:proofErr w:type="spellEnd"/>
+      <w:r>
+        <w:t>, nombre del cliente, logo URL, versión</w:t>
       </w:r>
     </w:p>
     <w:p>
@@ -866,10 +1225,43 @@
           <w:b/>
           <w:bCs/>
         </w:rPr>
-        <w:t>**`.firebaserc`**</w:t>
-      </w:r>
-      <w:r>
-        <w:t xml:space="preserve"> → Cambia el `project ID` al del cliente nuevo</w:t>
+        <w:t>**</w:t>
+      </w:r>
+      <w:proofErr w:type="gramStart"/>
+      <w:r>
+        <w:rPr>
+          <w:b/>
+          <w:bCs/>
+        </w:rPr>
+        <w:t>`.</w:t>
+      </w:r>
+      <w:proofErr w:type="spellStart"/>
+      <w:r>
+        <w:rPr>
+          <w:b/>
+          <w:bCs/>
+        </w:rPr>
+        <w:t>firebaserc</w:t>
+      </w:r>
+      <w:proofErr w:type="spellEnd"/>
+      <w:proofErr w:type="gramEnd"/>
+      <w:r>
+        <w:rPr>
+          <w:b/>
+          <w:bCs/>
+        </w:rPr>
+        <w:t>`**</w:t>
+      </w:r>
+      <w:r>
+        <w:t xml:space="preserve"> → Cambia el `</w:t>
+      </w:r>
+      <w:proofErr w:type="spellStart"/>
+      <w:r>
+        <w:t>project</w:t>
+      </w:r>
+      <w:proofErr w:type="spellEnd"/>
+      <w:r>
+        <w:t xml:space="preserve"> ID` al del cliente nuevo</w:t>
       </w:r>
     </w:p>
     <w:p>
@@ -884,7 +1276,15 @@
         <w:t>**`DEPLOY_*.bat`**</w:t>
       </w:r>
       <w:r>
-        <w:t xml:space="preserve"> → Cambia el nombre del cliente y el `--project &lt;id&gt;` al del cliente nuevo</w:t>
+        <w:t xml:space="preserve"> → Cambia el nombre del cliente y el `--</w:t>
+      </w:r>
+      <w:proofErr w:type="spellStart"/>
+      <w:r>
+        <w:t>project</w:t>
+      </w:r>
+      <w:proofErr w:type="spellEnd"/>
+      <w:r>
+        <w:t xml:space="preserve"> &lt;id&gt;` al del cliente nuevo</w:t>
       </w:r>
     </w:p>
     <w:p>
@@ -905,8 +1305,17 @@
           <w:b/>
           <w:bCs/>
         </w:rPr>
-        <w:t>## PASO 4 — Primer Deploy</w:t>
-      </w:r>
+        <w:t xml:space="preserve">## PASO 4 — Primer </w:t>
+      </w:r>
+      <w:proofErr w:type="spellStart"/>
+      <w:r>
+        <w:rPr>
+          <w:b/>
+          <w:bCs/>
+        </w:rPr>
+        <w:t>Deploy</w:t>
+      </w:r>
+      <w:proofErr w:type="spellEnd"/>
     </w:p>
     <w:p/>
     <w:p>
@@ -916,7 +1325,28 @@
     </w:p>
     <w:p>
       <w:r>
-        <w:t>1. Copia el `.env` correcto</w:t>
+        <w:t xml:space="preserve">1. Copia </w:t>
+      </w:r>
+      <w:proofErr w:type="spellStart"/>
+      <w:r>
+        <w:t>el</w:t>
+      </w:r>
+      <w:proofErr w:type="spellEnd"/>
+      <w:r>
+        <w:t xml:space="preserve"> </w:t>
+      </w:r>
+      <w:proofErr w:type="gramStart"/>
+      <w:r>
+        <w:t>`.</w:t>
+      </w:r>
+      <w:proofErr w:type="spellStart"/>
+      <w:r>
+        <w:t>env</w:t>
+      </w:r>
+      <w:proofErr w:type="spellEnd"/>
+      <w:proofErr w:type="gramEnd"/>
+      <w:r>
+        <w:t>` correcto</w:t>
       </w:r>
     </w:p>
     <w:p>
@@ -926,8 +1356,13 @@
     </w:p>
     <w:p>
       <w:r>
-        <w:t>3. Construye la app</w:t>
-      </w:r>
+        <w:t xml:space="preserve">3. Construye la </w:t>
+      </w:r>
+      <w:proofErr w:type="gramStart"/>
+      <w:r>
+        <w:t>app</w:t>
+      </w:r>
+      <w:proofErr w:type="gramEnd"/>
     </w:p>
     <w:p>
       <w:r>
@@ -936,8 +1371,13 @@
     </w:p>
     <w:p>
       <w:r>
-        <w:t>5. Despliega las Cloud Functions</w:t>
-      </w:r>
+        <w:t xml:space="preserve">5. Despliega las Cloud </w:t>
+      </w:r>
+      <w:proofErr w:type="spellStart"/>
+      <w:r>
+        <w:t>Functions</w:t>
+      </w:r>
+      <w:proofErr w:type="spellEnd"/>
     </w:p>
     <w:p/>
     <w:p>
@@ -952,13 +1392,37 @@
           <w:b/>
           <w:bCs/>
         </w:rPr>
-        <w:t>## PASO 5 — Activar Invocador Público (Solo el Primer Deploy)</w:t>
+        <w:t xml:space="preserve">## PASO 5 — Activar Invocador Público (Solo el Primer </w:t>
+      </w:r>
+      <w:proofErr w:type="spellStart"/>
+      <w:r>
+        <w:rPr>
+          <w:b/>
+          <w:bCs/>
+        </w:rPr>
+        <w:t>Deploy</w:t>
+      </w:r>
+      <w:proofErr w:type="spellEnd"/>
+      <w:r>
+        <w:rPr>
+          <w:b/>
+          <w:bCs/>
+        </w:rPr>
+        <w:t>)</w:t>
       </w:r>
     </w:p>
     <w:p/>
     <w:p>
       <w:r>
-        <w:t>&gt; [!IMPORTANT]</w:t>
+        <w:t xml:space="preserve">&gt; </w:t>
+      </w:r>
+      <w:proofErr w:type="gramStart"/>
+      <w:r>
+        <w:t>[!IMPORTANT</w:t>
+      </w:r>
+      <w:proofErr w:type="gramEnd"/>
+      <w:r>
+        <w:t>]</w:t>
       </w:r>
     </w:p>
     <w:p>
@@ -992,7 +1456,55 @@
     </w:p>
     <w:p>
       <w:r>
-        <w:t>2. Para cada función de la lista (`verifyAdminPassword`, `changeAdminPassword`, `deleteUser`, `getUsersList`, `createEmployeeSecure`, `verifyLicenseToken`):</w:t>
+        <w:t>2. Para cada función de la lista (`</w:t>
+      </w:r>
+      <w:proofErr w:type="spellStart"/>
+      <w:r>
+        <w:t>verifyAdminPassword</w:t>
+      </w:r>
+      <w:proofErr w:type="spellEnd"/>
+      <w:r>
+        <w:t>`, `</w:t>
+      </w:r>
+      <w:proofErr w:type="spellStart"/>
+      <w:r>
+        <w:t>changeAdminPassword</w:t>
+      </w:r>
+      <w:proofErr w:type="spellEnd"/>
+      <w:r>
+        <w:t>`, `</w:t>
+      </w:r>
+      <w:proofErr w:type="spellStart"/>
+      <w:r>
+        <w:t>deleteUser</w:t>
+      </w:r>
+      <w:proofErr w:type="spellEnd"/>
+      <w:r>
+        <w:t>`, `</w:t>
+      </w:r>
+      <w:proofErr w:type="spellStart"/>
+      <w:r>
+        <w:t>getUsersList</w:t>
+      </w:r>
+      <w:proofErr w:type="spellEnd"/>
+      <w:r>
+        <w:t>`, `</w:t>
+      </w:r>
+      <w:proofErr w:type="spellStart"/>
+      <w:r>
+        <w:t>createEmployeeSecure</w:t>
+      </w:r>
+      <w:proofErr w:type="spellEnd"/>
+      <w:r>
+        <w:t>`, `</w:t>
+      </w:r>
+      <w:proofErr w:type="spellStart"/>
+      <w:r>
+        <w:t>verifyLicenseToken</w:t>
+      </w:r>
+      <w:proofErr w:type="spellEnd"/>
+      <w:r>
+        <w:t>`):</w:t>
       </w:r>
     </w:p>
     <w:p>
@@ -1019,7 +1531,15 @@
         <w:t>**Agregar principal**</w:t>
       </w:r>
       <w:r>
-        <w:t xml:space="preserve"> → `allUsers` → Rol: </w:t>
+        <w:t xml:space="preserve"> → `</w:t>
+      </w:r>
+      <w:proofErr w:type="spellStart"/>
+      <w:r>
+        <w:t>allUsers</w:t>
+      </w:r>
+      <w:proofErr w:type="spellEnd"/>
+      <w:r>
+        <w:t xml:space="preserve">` → Rol: </w:t>
       </w:r>
       <w:r>
         <w:rPr>
@@ -1053,7 +1573,15 @@
     <w:p/>
     <w:p>
       <w:r>
-        <w:t>1. El cliente abre la URL de su app.</w:t>
+        <w:t xml:space="preserve">1. El cliente abre la URL de su </w:t>
+      </w:r>
+      <w:proofErr w:type="gramStart"/>
+      <w:r>
+        <w:t>app</w:t>
+      </w:r>
+      <w:proofErr w:type="gramEnd"/>
+      <w:r>
+        <w:t>.</w:t>
       </w:r>
     </w:p>
     <w:p>
@@ -1148,7 +1676,15 @@
     <w:p/>
     <w:p>
       <w:r>
-        <w:t>&gt; [!TIP]</w:t>
+        <w:t xml:space="preserve">&gt; </w:t>
+      </w:r>
+      <w:proofErr w:type="gramStart"/>
+      <w:r>
+        <w:t>[!TIP</w:t>
+      </w:r>
+      <w:proofErr w:type="gramEnd"/>
+      <w:r>
+        <w:t>]</w:t>
       </w:r>
     </w:p>
     <w:p>

</xml_diff>

<commit_message>
v1.6.99: Servicio offline total, identificación de estado (Entrada/Salida) independiente para múltiples usuarios por dispositivo, y persistencia optimizada con localStorage.
</commit_message>
<xml_diff>
--- a/CORS muy importante y 7 pasos para cliente nuevo.docx
+++ b/CORS muy importante y 7 pasos para cliente nuevo.docx
@@ -1380,18 +1380,16 @@
       <w:proofErr w:type="spellEnd"/>
     </w:p>
     <w:p/>
-    <w:p>
-      <w:r>
-        <w:t>---</w:t>
-      </w:r>
-    </w:p>
     <w:p/>
-    <w:p>
-      <w:r>
-        <w:rPr>
-          <w:b/>
-          <w:bCs/>
-        </w:rPr>
+    <w:p/>
+    <w:p/>
+    <w:p>
+      <w:r>
+        <w:rPr>
+          <w:b/>
+          <w:bCs/>
+        </w:rPr>
+        <w:lastRenderedPageBreak/>
         <w:t xml:space="preserve">## PASO 5 — Activar Invocador Público (Solo el Primer </w:t>
       </w:r>
       <w:proofErr w:type="spellStart"/>

</xml_diff>

<commit_message>
Implementación del Sistema de Gestión de Licencias v1.7.68 - Final
</commit_message>
<xml_diff>
--- a/CORS muy importante y 7 pasos para cliente nuevo.docx
+++ b/CORS muy importante y 7 pasos para cliente nuevo.docx
@@ -579,12 +579,14 @@
       </w:r>
     </w:p>
     <w:p/>
-    <w:p>
-      <w:r>
-        <w:rPr>
-          <w:b/>
-          <w:bCs/>
-        </w:rPr>
+    <w:p/>
+    <w:p>
+      <w:r>
+        <w:rPr>
+          <w:b/>
+          <w:bCs/>
+        </w:rPr>
+        <w:lastRenderedPageBreak/>
         <w:t xml:space="preserve">## PASO 1 — El Cliente Crea su Proyecto </w:t>
       </w:r>
       <w:proofErr w:type="spellStart"/>
@@ -1107,6 +1109,7 @@
     <w:p/>
     <w:p>
       <w:r>
+        <w:lastRenderedPageBreak/>
         <w:t>---</w:t>
       </w:r>
     </w:p>
@@ -1389,7 +1392,6 @@
           <w:b/>
           <w:bCs/>
         </w:rPr>
-        <w:lastRenderedPageBreak/>
         <w:t xml:space="preserve">## PASO 5 — Activar Invocador Público (Solo el Primer </w:t>
       </w:r>
       <w:proofErr w:type="spellStart"/>
@@ -1651,7 +1653,6 @@
     <w:p/>
     <w:p>
       <w:r>
-        <w:lastRenderedPageBreak/>
         <w:t xml:space="preserve">Desde dentro de </w:t>
       </w:r>
       <w:r>

</xml_diff>

<commit_message>
v1.7.111 - Auditoría de integridad, mejoras de seguridad GPS y optimización de reportes.
Dashboard: Relajación de validaciones GPS (ERR-02/05/06) para evitar falsos positivos y refuerzo de detección de liveness (ERR-07) con escaneo multi-capa.
Informes: Inclusión de reportes de inconsistencias de seguridad y herramientas de limpieza masiva.
Gestión: Actualización del motor de despliegue y diccionarios de errores.
</commit_message>
<xml_diff>
--- a/CORS muy importante y 7 pasos para cliente nuevo.docx
+++ b/CORS muy importante y 7 pasos para cliente nuevo.docx
@@ -153,7 +153,23 @@
             <w:b/>
             <w:bCs/>
           </w:rPr>
-          <w:t>Google Cloud Shell para tu proyecto</w:t>
+          <w:t>Google C</w:t>
+        </w:r>
+        <w:r>
+          <w:rPr>
+            <w:rStyle w:val="Hipervnculo"/>
+            <w:b/>
+            <w:bCs/>
+          </w:rPr>
+          <w:t>l</w:t>
+        </w:r>
+        <w:r>
+          <w:rPr>
+            <w:rStyle w:val="Hipervnculo"/>
+            <w:b/>
+            <w:bCs/>
+          </w:rPr>
+          <w:t>oud Shell para tu proyecto</w:t>
         </w:r>
       </w:hyperlink>
     </w:p>
@@ -196,94 +212,74 @@
       <w:r>
         <w:t xml:space="preserve"> temporalmente y le cargamos las reglas):</w:t>
       </w:r>
-    </w:p>
-    <w:p>
-      <w:pPr>
-        <w:rPr>
-          <w:color w:val="EE0000"/>
-          <w:lang w:val="en-US"/>
-        </w:rPr>
-      </w:pPr>
-      <w:r>
-        <w:rPr>
-          <w:color w:val="EE0000"/>
-          <w:lang w:val="en-US"/>
-        </w:rPr>
-        <w:t xml:space="preserve">echo </w:t>
-      </w:r>
-      <w:proofErr w:type="gramStart"/>
-      <w:r>
-        <w:rPr>
-          <w:color w:val="EE0000"/>
-          <w:lang w:val="en-US"/>
-        </w:rPr>
-        <w:t>'[{</w:t>
-      </w:r>
-      <w:proofErr w:type="gramEnd"/>
-      <w:r>
-        <w:rPr>
-          <w:color w:val="EE0000"/>
-          <w:lang w:val="en-US"/>
-        </w:rPr>
-        <w:t>"origin": ["*"],"method": ["GET"],"</w:t>
-      </w:r>
-      <w:proofErr w:type="spellStart"/>
-      <w:r>
-        <w:rPr>
-          <w:color w:val="EE0000"/>
-          <w:lang w:val="en-US"/>
-        </w:rPr>
-        <w:t>maxAgeSeconds</w:t>
-      </w:r>
-      <w:proofErr w:type="spellEnd"/>
-      <w:r>
-        <w:rPr>
-          <w:color w:val="EE0000"/>
-          <w:lang w:val="en-US"/>
-        </w:rPr>
-        <w:t xml:space="preserve">": </w:t>
-      </w:r>
-      <w:proofErr w:type="gramStart"/>
-      <w:r>
-        <w:rPr>
-          <w:color w:val="EE0000"/>
-          <w:lang w:val="en-US"/>
-        </w:rPr>
-        <w:t>3600}]</w:t>
-      </w:r>
-      <w:proofErr w:type="gramEnd"/>
-      <w:r>
-        <w:rPr>
-          <w:color w:val="EE0000"/>
-          <w:lang w:val="en-US"/>
-        </w:rPr>
-        <w:t xml:space="preserve">' &gt; </w:t>
-      </w:r>
-      <w:proofErr w:type="spellStart"/>
-      <w:proofErr w:type="gramStart"/>
-      <w:r>
-        <w:rPr>
-          <w:color w:val="EE0000"/>
-          <w:lang w:val="en-US"/>
-        </w:rPr>
-        <w:t>cors.json</w:t>
-      </w:r>
-      <w:proofErr w:type="spellEnd"/>
-      <w:proofErr w:type="gramEnd"/>
-    </w:p>
-    <w:p>
-      <w:pPr>
-        <w:rPr>
-          <w:lang w:val="en-US"/>
-        </w:rPr>
-      </w:pPr>
       <w:r>
         <w:rPr>
           <w:noProof/>
+        </w:rPr>
+        <w:t xml:space="preserve"> </w:t>
+      </w:r>
+    </w:p>
+    <w:p>
+      <w:pPr>
+        <w:numPr>
+          <w:ilvl w:val="0"/>
+          <w:numId w:val="6"/>
+        </w:numPr>
+      </w:pPr>
+      <w:r>
+        <w:rPr>
+          <w:noProof/>
           <w:lang w:val="en-US"/>
         </w:rPr>
         <w:drawing>
-          <wp:inline distT="0" distB="0" distL="0" distR="0" wp14:anchorId="0E841F5D" wp14:editId="3B1B5A20">
+          <wp:inline distT="0" distB="0" distL="0" distR="0" wp14:anchorId="0899ECE3" wp14:editId="14216E8C">
+            <wp:extent cx="2044856" cy="1124136"/>
+            <wp:effectExtent l="0" t="0" r="0" b="0"/>
+            <wp:docPr id="1408469329" name="Imagen 1"/>
+            <wp:cNvGraphicFramePr>
+              <a:graphicFrameLocks xmlns:a="http://schemas.openxmlformats.org/drawingml/2006/main" noChangeAspect="1"/>
+            </wp:cNvGraphicFramePr>
+            <a:graphic xmlns:a="http://schemas.openxmlformats.org/drawingml/2006/main">
+              <a:graphicData uri="http://schemas.openxmlformats.org/drawingml/2006/picture">
+                <pic:pic xmlns:pic="http://schemas.openxmlformats.org/drawingml/2006/picture">
+                  <pic:nvPicPr>
+                    <pic:cNvPr id="1408469329" name=""/>
+                    <pic:cNvPicPr/>
+                  </pic:nvPicPr>
+                  <pic:blipFill>
+                    <a:blip r:embed="rId6"/>
+                    <a:stretch>
+                      <a:fillRect/>
+                    </a:stretch>
+                  </pic:blipFill>
+                  <pic:spPr>
+                    <a:xfrm>
+                      <a:off x="0" y="0"/>
+                      <a:ext cx="2052534" cy="1128357"/>
+                    </a:xfrm>
+                    <a:prstGeom prst="rect">
+                      <a:avLst/>
+                    </a:prstGeom>
+                  </pic:spPr>
+                </pic:pic>
+              </a:graphicData>
+            </a:graphic>
+          </wp:inline>
+        </w:drawing>
+      </w:r>
+      <w:r>
+        <w:rPr>
+          <w:noProof/>
+        </w:rPr>
+        <w:t xml:space="preserve"> </w:t>
+      </w:r>
+      <w:r>
+        <w:rPr>
+          <w:noProof/>
+          <w:lang w:val="en-US"/>
+        </w:rPr>
+        <w:drawing>
+          <wp:inline distT="0" distB="0" distL="0" distR="0" wp14:anchorId="73C3B848" wp14:editId="368191F3">
             <wp:extent cx="2311111" cy="1087582"/>
             <wp:effectExtent l="0" t="0" r="0" b="0"/>
             <wp:docPr id="2039503163" name="Imagen 1"/>
@@ -298,7 +294,7 @@
                     <pic:cNvPicPr/>
                   </pic:nvPicPr>
                   <pic:blipFill>
-                    <a:blip r:embed="rId6"/>
+                    <a:blip r:embed="rId7"/>
                     <a:stretch>
                       <a:fillRect/>
                     </a:stretch>
@@ -318,53 +314,6 @@
           </wp:inline>
         </w:drawing>
       </w:r>
-      <w:r>
-        <w:rPr>
-          <w:lang w:val="en-US"/>
-        </w:rPr>
-        <w:t xml:space="preserve">        </w:t>
-      </w:r>
-      <w:r>
-        <w:rPr>
-          <w:noProof/>
-          <w:lang w:val="en-US"/>
-        </w:rPr>
-        <w:drawing>
-          <wp:inline distT="0" distB="0" distL="0" distR="0" wp14:anchorId="41E1A3CF" wp14:editId="4C7BB78E">
-            <wp:extent cx="2044856" cy="1124136"/>
-            <wp:effectExtent l="0" t="0" r="0" b="0"/>
-            <wp:docPr id="1408469329" name="Imagen 1"/>
-            <wp:cNvGraphicFramePr>
-              <a:graphicFrameLocks xmlns:a="http://schemas.openxmlformats.org/drawingml/2006/main" noChangeAspect="1"/>
-            </wp:cNvGraphicFramePr>
-            <a:graphic xmlns:a="http://schemas.openxmlformats.org/drawingml/2006/main">
-              <a:graphicData uri="http://schemas.openxmlformats.org/drawingml/2006/picture">
-                <pic:pic xmlns:pic="http://schemas.openxmlformats.org/drawingml/2006/picture">
-                  <pic:nvPicPr>
-                    <pic:cNvPr id="1408469329" name=""/>
-                    <pic:cNvPicPr/>
-                  </pic:nvPicPr>
-                  <pic:blipFill>
-                    <a:blip r:embed="rId7"/>
-                    <a:stretch>
-                      <a:fillRect/>
-                    </a:stretch>
-                  </pic:blipFill>
-                  <pic:spPr>
-                    <a:xfrm>
-                      <a:off x="0" y="0"/>
-                      <a:ext cx="2052534" cy="1128357"/>
-                    </a:xfrm>
-                    <a:prstGeom prst="rect">
-                      <a:avLst/>
-                    </a:prstGeom>
-                  </pic:spPr>
-                </pic:pic>
-              </a:graphicData>
-            </a:graphic>
-          </wp:inline>
-        </w:drawing>
-      </w:r>
     </w:p>
     <w:p>
       <w:pPr>
@@ -378,7 +327,31 @@
           <w:color w:val="EE0000"/>
           <w:lang w:val="en-US"/>
         </w:rPr>
-        <w:t>gcloud storage buckets update gs://control-de-entrada-3d85b.firebasestorage.app --cors-file=</w:t>
+        <w:br/>
+      </w:r>
+    </w:p>
+    <w:p>
+      <w:pPr>
+        <w:rPr>
+          <w:color w:val="EE0000"/>
+          <w:lang w:val="en-US"/>
+        </w:rPr>
+      </w:pPr>
+    </w:p>
+    <w:p>
+      <w:pPr>
+        <w:rPr>
+          <w:color w:val="EE0000"/>
+          <w:lang w:val="en-US"/>
+        </w:rPr>
+      </w:pPr>
+      <w:r>
+        <w:rPr>
+          <w:color w:val="EE0000"/>
+          <w:lang w:val="en-US"/>
+        </w:rPr>
+        <w:lastRenderedPageBreak/>
+        <w:t xml:space="preserve">echo </w:t>
       </w:r>
       <w:proofErr w:type="gramStart"/>
       <w:r>
@@ -386,17 +359,99 @@
           <w:color w:val="EE0000"/>
           <w:lang w:val="en-US"/>
         </w:rPr>
+        <w:t>'[{</w:t>
+      </w:r>
+      <w:proofErr w:type="gramEnd"/>
+      <w:r>
+        <w:rPr>
+          <w:color w:val="EE0000"/>
+          <w:lang w:val="en-US"/>
+        </w:rPr>
+        <w:t>"origin": ["*"],"method": ["GET"],"</w:t>
+      </w:r>
+      <w:proofErr w:type="spellStart"/>
+      <w:r>
+        <w:rPr>
+          <w:color w:val="EE0000"/>
+          <w:lang w:val="en-US"/>
+        </w:rPr>
+        <w:t>maxAgeSeconds</w:t>
+      </w:r>
+      <w:proofErr w:type="spellEnd"/>
+      <w:r>
+        <w:rPr>
+          <w:color w:val="EE0000"/>
+          <w:lang w:val="en-US"/>
+        </w:rPr>
+        <w:t xml:space="preserve">": </w:t>
+      </w:r>
+      <w:proofErr w:type="gramStart"/>
+      <w:r>
+        <w:rPr>
+          <w:color w:val="EE0000"/>
+          <w:lang w:val="en-US"/>
+        </w:rPr>
+        <w:t>3600}]</w:t>
+      </w:r>
+      <w:proofErr w:type="gramEnd"/>
+      <w:r>
+        <w:rPr>
+          <w:color w:val="EE0000"/>
+          <w:lang w:val="en-US"/>
+        </w:rPr>
+        <w:t xml:space="preserve">' &gt; </w:t>
+      </w:r>
+      <w:proofErr w:type="spellStart"/>
+      <w:proofErr w:type="gramStart"/>
+      <w:r>
+        <w:rPr>
+          <w:color w:val="EE0000"/>
+          <w:lang w:val="en-US"/>
+        </w:rPr>
         <w:t>cors.json</w:t>
       </w:r>
+      <w:proofErr w:type="spellEnd"/>
       <w:proofErr w:type="gramEnd"/>
-    </w:p>
-    <w:p>
-      <w:pPr>
+      <w:r>
         <w:rPr>
           <w:color w:val="EE0000"/>
           <w:lang w:val="en-US"/>
         </w:rPr>
-      </w:pPr>
+        <w:t xml:space="preserve"> </w:t>
+      </w:r>
+    </w:p>
+    <w:p>
+      <w:pPr>
+        <w:rPr>
+          <w:color w:val="EE0000"/>
+          <w:lang w:val="en-US"/>
+        </w:rPr>
+      </w:pPr>
+      <w:proofErr w:type="spellStart"/>
+      <w:r>
+        <w:rPr>
+          <w:color w:val="EE0000"/>
+          <w:lang w:val="en-US"/>
+        </w:rPr>
+        <w:t>gcloud</w:t>
+      </w:r>
+      <w:proofErr w:type="spellEnd"/>
+      <w:r>
+        <w:rPr>
+          <w:color w:val="EE0000"/>
+          <w:lang w:val="en-US"/>
+        </w:rPr>
+        <w:t xml:space="preserve"> storage buckets update gs://control-de-entrada-3d85b.firebasestorage.app --cors-file=</w:t>
+      </w:r>
+      <w:proofErr w:type="gramStart"/>
+      <w:r>
+        <w:rPr>
+          <w:color w:val="EE0000"/>
+          <w:lang w:val="en-US"/>
+        </w:rPr>
+        <w:t>cors.json</w:t>
+      </w:r>
+      <w:proofErr w:type="gramEnd"/>
     </w:p>
     <w:p>
       <w:r>
@@ -586,7 +641,6 @@
           <w:b/>
           <w:bCs/>
         </w:rPr>
-        <w:lastRenderedPageBreak/>
         <w:t xml:space="preserve">## PASO 1 — El Cliente Crea su Proyecto </w:t>
       </w:r>
       <w:proofErr w:type="spellStart"/>
@@ -1103,13 +1157,13 @@
     </w:p>
     <w:p>
       <w:r>
+        <w:lastRenderedPageBreak/>
         <w:t>- Guardar</w:t>
       </w:r>
     </w:p>
     <w:p/>
     <w:p>
       <w:r>
-        <w:lastRenderedPageBreak/>
         <w:t>---</w:t>
       </w:r>
     </w:p>
@@ -1552,6 +1606,52 @@
     <w:p>
       <w:r>
         <w:t>   - Guardar → Confirmar acceso público</w:t>
+      </w:r>
+      <w:r>
+        <w:rPr>
+          <w:noProof/>
+        </w:rPr>
+        <w:t xml:space="preserve"> </w:t>
+      </w:r>
+      <w:r>
+        <w:rPr>
+          <w:noProof/>
+        </w:rPr>
+        <w:drawing>
+          <wp:inline distT="0" distB="0" distL="0" distR="0" wp14:anchorId="67294BC7" wp14:editId="364D068F">
+            <wp:extent cx="2552831" cy="3676839"/>
+            <wp:effectExtent l="0" t="0" r="0" b="0"/>
+            <wp:docPr id="1374809261" name="Imagen 1"/>
+            <wp:cNvGraphicFramePr>
+              <a:graphicFrameLocks xmlns:a="http://schemas.openxmlformats.org/drawingml/2006/main" noChangeAspect="1"/>
+            </wp:cNvGraphicFramePr>
+            <a:graphic xmlns:a="http://schemas.openxmlformats.org/drawingml/2006/main">
+              <a:graphicData uri="http://schemas.openxmlformats.org/drawingml/2006/picture">
+                <pic:pic xmlns:pic="http://schemas.openxmlformats.org/drawingml/2006/picture">
+                  <pic:nvPicPr>
+                    <pic:cNvPr id="1374809261" name=""/>
+                    <pic:cNvPicPr/>
+                  </pic:nvPicPr>
+                  <pic:blipFill>
+                    <a:blip r:embed="rId11"/>
+                    <a:stretch>
+                      <a:fillRect/>
+                    </a:stretch>
+                  </pic:blipFill>
+                  <pic:spPr>
+                    <a:xfrm>
+                      <a:off x="0" y="0"/>
+                      <a:ext cx="2552831" cy="3676839"/>
+                    </a:xfrm>
+                    <a:prstGeom prst="rect">
+                      <a:avLst/>
+                    </a:prstGeom>
+                  </pic:spPr>
+                </pic:pic>
+              </a:graphicData>
+            </a:graphic>
+          </wp:inline>
+        </w:drawing>
       </w:r>
     </w:p>
     <w:p/>

</xml_diff>